<commit_message>
Updated documentation and data transformation
</commit_message>
<xml_diff>
--- a/Hotel Bookings Analysis Documentation.docx
+++ b/Hotel Bookings Analysis Documentation.docx
@@ -8401,17 +8401,20 @@
         </w:numPr>
         <w:rPr>
           <w:rFonts w:ascii="Calibri" w:hAnsi="Calibri" w:cs="Calibri"/>
-        </w:rPr>
-      </w:pPr>
-      <w:r>
-        <w:rPr>
-          <w:rFonts w:ascii="Calibri" w:hAnsi="Calibri" w:cs="Calibri"/>
+          <w:highlight w:val="green"/>
+        </w:rPr>
+      </w:pPr>
+      <w:r>
+        <w:rPr>
+          <w:rFonts w:ascii="Calibri" w:hAnsi="Calibri" w:cs="Calibri"/>
+          <w:highlight w:val="green"/>
         </w:rPr>
         <w:t>Hotel</w:t>
       </w:r>
       <w:r>
         <w:rPr>
           <w:rFonts w:ascii="Calibri" w:hAnsi="Calibri" w:cs="Calibri"/>
+          <w:highlight w:val="green"/>
         </w:rPr>
         <w:t xml:space="preserve"> (categories)</w:t>
       </w:r>
@@ -8430,6 +8433,7 @@
       <w:r>
         <w:rPr>
           <w:rFonts w:ascii="Calibri" w:hAnsi="Calibri" w:cs="Calibri"/>
+          <w:highlight w:val="green"/>
         </w:rPr>
         <w:t>Count</w:t>
       </w:r>
@@ -8443,23 +8447,27 @@
         </w:numPr>
         <w:rPr>
           <w:rFonts w:ascii="Calibri" w:hAnsi="Calibri" w:cs="Calibri"/>
-        </w:rPr>
-      </w:pPr>
-      <w:r>
-        <w:rPr>
-          <w:rFonts w:ascii="Calibri" w:hAnsi="Calibri" w:cs="Calibri"/>
+          <w:highlight w:val="green"/>
+        </w:rPr>
+      </w:pPr>
+      <w:r>
+        <w:rPr>
+          <w:rFonts w:ascii="Calibri" w:hAnsi="Calibri" w:cs="Calibri"/>
+          <w:highlight w:val="green"/>
         </w:rPr>
         <w:t>C</w:t>
       </w:r>
       <w:r>
         <w:rPr>
           <w:rFonts w:ascii="Calibri" w:hAnsi="Calibri" w:cs="Calibri"/>
+          <w:highlight w:val="green"/>
         </w:rPr>
         <w:t>ountry</w:t>
       </w:r>
       <w:r>
         <w:rPr>
           <w:rFonts w:ascii="Calibri" w:hAnsi="Calibri" w:cs="Calibri"/>
+          <w:highlight w:val="green"/>
         </w:rPr>
         <w:t xml:space="preserve"> (Categories)</w:t>
       </w:r>
@@ -8473,11 +8481,13 @@
         </w:numPr>
         <w:rPr>
           <w:rFonts w:ascii="Calibri" w:hAnsi="Calibri" w:cs="Calibri"/>
-        </w:rPr>
-      </w:pPr>
-      <w:r>
-        <w:rPr>
-          <w:rFonts w:ascii="Calibri" w:hAnsi="Calibri" w:cs="Calibri"/>
+          <w:highlight w:val="green"/>
+        </w:rPr>
+      </w:pPr>
+      <w:r>
+        <w:rPr>
+          <w:rFonts w:ascii="Calibri" w:hAnsi="Calibri" w:cs="Calibri"/>
+          <w:highlight w:val="green"/>
         </w:rPr>
         <w:t>Count by channel</w:t>
       </w:r>
@@ -8491,23 +8501,27 @@
         </w:numPr>
         <w:rPr>
           <w:rFonts w:ascii="Calibri" w:hAnsi="Calibri" w:cs="Calibri"/>
-        </w:rPr>
-      </w:pPr>
-      <w:r>
-        <w:rPr>
-          <w:rFonts w:ascii="Calibri" w:hAnsi="Calibri" w:cs="Calibri"/>
+          <w:highlight w:val="green"/>
+        </w:rPr>
+      </w:pPr>
+      <w:r>
+        <w:rPr>
+          <w:rFonts w:ascii="Calibri" w:hAnsi="Calibri" w:cs="Calibri"/>
+          <w:highlight w:val="green"/>
         </w:rPr>
         <w:t>Distribution</w:t>
       </w:r>
       <w:r>
         <w:rPr>
           <w:rFonts w:ascii="Calibri" w:hAnsi="Calibri" w:cs="Calibri"/>
+          <w:highlight w:val="green"/>
         </w:rPr>
         <w:t xml:space="preserve"> channel</w:t>
       </w:r>
       <w:r>
         <w:rPr>
           <w:rFonts w:ascii="Calibri" w:hAnsi="Calibri" w:cs="Calibri"/>
+          <w:highlight w:val="green"/>
         </w:rPr>
         <w:t xml:space="preserve"> (categories)</w:t>
       </w:r>
@@ -8521,11 +8535,13 @@
         </w:numPr>
         <w:rPr>
           <w:rFonts w:ascii="Calibri" w:hAnsi="Calibri" w:cs="Calibri"/>
-        </w:rPr>
-      </w:pPr>
-      <w:r>
-        <w:rPr>
-          <w:rFonts w:ascii="Calibri" w:hAnsi="Calibri" w:cs="Calibri"/>
+          <w:highlight w:val="green"/>
+        </w:rPr>
+      </w:pPr>
+      <w:r>
+        <w:rPr>
+          <w:rFonts w:ascii="Calibri" w:hAnsi="Calibri" w:cs="Calibri"/>
+          <w:highlight w:val="green"/>
         </w:rPr>
         <w:t>Count by channel</w:t>
       </w:r>
@@ -8539,17 +8555,20 @@
         </w:numPr>
         <w:rPr>
           <w:rFonts w:ascii="Calibri" w:hAnsi="Calibri" w:cs="Calibri"/>
-        </w:rPr>
-      </w:pPr>
-      <w:r>
-        <w:rPr>
-          <w:rFonts w:ascii="Calibri" w:hAnsi="Calibri" w:cs="Calibri"/>
+          <w:highlight w:val="green"/>
+        </w:rPr>
+      </w:pPr>
+      <w:r>
+        <w:rPr>
+          <w:rFonts w:ascii="Calibri" w:hAnsi="Calibri" w:cs="Calibri"/>
+          <w:highlight w:val="green"/>
         </w:rPr>
         <w:t>Repeat guest</w:t>
       </w:r>
       <w:r>
         <w:rPr>
           <w:rFonts w:ascii="Calibri" w:hAnsi="Calibri" w:cs="Calibri"/>
+          <w:highlight w:val="green"/>
         </w:rPr>
         <w:t>: Yes/ No</w:t>
       </w:r>
@@ -8563,11 +8582,13 @@
         </w:numPr>
         <w:rPr>
           <w:rFonts w:ascii="Calibri" w:hAnsi="Calibri" w:cs="Calibri"/>
-        </w:rPr>
-      </w:pPr>
-      <w:r>
-        <w:rPr>
-          <w:rFonts w:ascii="Calibri" w:hAnsi="Calibri" w:cs="Calibri"/>
+          <w:highlight w:val="green"/>
+        </w:rPr>
+      </w:pPr>
+      <w:r>
+        <w:rPr>
+          <w:rFonts w:ascii="Calibri" w:hAnsi="Calibri" w:cs="Calibri"/>
+          <w:highlight w:val="green"/>
         </w:rPr>
         <w:t>Count</w:t>
       </w:r>
@@ -8581,11 +8602,13 @@
         </w:numPr>
         <w:rPr>
           <w:rFonts w:ascii="Calibri" w:hAnsi="Calibri" w:cs="Calibri"/>
-        </w:rPr>
-      </w:pPr>
-      <w:r>
-        <w:rPr>
-          <w:rFonts w:ascii="Calibri" w:hAnsi="Calibri" w:cs="Calibri"/>
+          <w:highlight w:val="green"/>
+        </w:rPr>
+      </w:pPr>
+      <w:r>
+        <w:rPr>
+          <w:rFonts w:ascii="Calibri" w:hAnsi="Calibri" w:cs="Calibri"/>
+          <w:highlight w:val="green"/>
         </w:rPr>
         <w:t>Reserved room type</w:t>
       </w:r>
@@ -8599,11 +8622,13 @@
         </w:numPr>
         <w:rPr>
           <w:rFonts w:ascii="Calibri" w:hAnsi="Calibri" w:cs="Calibri"/>
-        </w:rPr>
-      </w:pPr>
-      <w:r>
-        <w:rPr>
-          <w:rFonts w:ascii="Calibri" w:hAnsi="Calibri" w:cs="Calibri"/>
+          <w:highlight w:val="green"/>
+        </w:rPr>
+      </w:pPr>
+      <w:r>
+        <w:rPr>
+          <w:rFonts w:ascii="Calibri" w:hAnsi="Calibri" w:cs="Calibri"/>
+          <w:highlight w:val="green"/>
         </w:rPr>
         <w:t>Count by type</w:t>
       </w:r>
@@ -8617,11 +8642,13 @@
         </w:numPr>
         <w:rPr>
           <w:rFonts w:ascii="Calibri" w:hAnsi="Calibri" w:cs="Calibri"/>
-        </w:rPr>
-      </w:pPr>
-      <w:r>
-        <w:rPr>
-          <w:rFonts w:ascii="Calibri" w:hAnsi="Calibri" w:cs="Calibri"/>
+          <w:highlight w:val="green"/>
+        </w:rPr>
+      </w:pPr>
+      <w:r>
+        <w:rPr>
+          <w:rFonts w:ascii="Calibri" w:hAnsi="Calibri" w:cs="Calibri"/>
+          <w:highlight w:val="green"/>
         </w:rPr>
         <w:t>Assigned room type</w:t>
       </w:r>
@@ -8635,59 +8662,69 @@
         </w:numPr>
         <w:rPr>
           <w:rFonts w:ascii="Calibri" w:hAnsi="Calibri" w:cs="Calibri"/>
-        </w:rPr>
-      </w:pPr>
-      <w:r>
-        <w:rPr>
-          <w:rFonts w:ascii="Calibri" w:hAnsi="Calibri" w:cs="Calibri"/>
+          <w:highlight w:val="green"/>
+        </w:rPr>
+      </w:pPr>
+      <w:r>
+        <w:rPr>
+          <w:rFonts w:ascii="Calibri" w:hAnsi="Calibri" w:cs="Calibri"/>
+          <w:highlight w:val="green"/>
         </w:rPr>
         <w:t>The count</w:t>
       </w:r>
       <w:r>
         <w:rPr>
           <w:rFonts w:ascii="Calibri" w:hAnsi="Calibri" w:cs="Calibri"/>
+          <w:highlight w:val="green"/>
         </w:rPr>
         <w:t xml:space="preserve"> no of times reserved was same as assigned</w:t>
       </w:r>
       <w:r>
         <w:rPr>
           <w:rFonts w:ascii="Calibri" w:hAnsi="Calibri" w:cs="Calibri"/>
+          <w:highlight w:val="green"/>
         </w:rPr>
         <w:t xml:space="preserve"> vs. </w:t>
       </w:r>
       <w:r>
         <w:rPr>
           <w:rFonts w:ascii="Calibri" w:hAnsi="Calibri" w:cs="Calibri"/>
+          <w:highlight w:val="green"/>
         </w:rPr>
         <w:t>the count</w:t>
       </w:r>
       <w:r>
         <w:rPr>
           <w:rFonts w:ascii="Calibri" w:hAnsi="Calibri" w:cs="Calibri"/>
+          <w:highlight w:val="green"/>
         </w:rPr>
         <w:t xml:space="preserve"> of </w:t>
       </w:r>
       <w:r>
         <w:rPr>
           <w:rFonts w:ascii="Calibri" w:hAnsi="Calibri" w:cs="Calibri"/>
+          <w:highlight w:val="green"/>
         </w:rPr>
         <w:t>ti</w:t>
       </w:r>
       <w:r>
         <w:rPr>
           <w:rFonts w:ascii="Calibri" w:hAnsi="Calibri" w:cs="Calibri"/>
+          <w:highlight w:val="green"/>
         </w:rPr>
         <w:t>m</w:t>
       </w:r>
       <w:r>
         <w:rPr>
           <w:rFonts w:ascii="Calibri" w:hAnsi="Calibri" w:cs="Calibri"/>
+          <w:highlight w:val="green"/>
         </w:rPr>
         <w:t>e</w:t>
       </w:r>
       <w:r>
         <w:rPr>
           <w:rFonts w:ascii="Calibri" w:hAnsi="Calibri" w:cs="Calibri"/>
+          <w:highlight w:val="green"/>
         </w:rPr>
         <w:t>s it was different.</w:t>
       </w:r>
@@ -8701,11 +8738,13 @@
         </w:numPr>
         <w:rPr>
           <w:rFonts w:ascii="Calibri" w:hAnsi="Calibri" w:cs="Calibri"/>
-        </w:rPr>
-      </w:pPr>
-      <w:r>
-        <w:rPr>
-          <w:rFonts w:ascii="Calibri" w:hAnsi="Calibri" w:cs="Calibri"/>
+          <w:highlight w:val="green"/>
+        </w:rPr>
+      </w:pPr>
+      <w:r>
+        <w:rPr>
+          <w:rFonts w:ascii="Calibri" w:hAnsi="Calibri" w:cs="Calibri"/>
+          <w:highlight w:val="green"/>
         </w:rPr>
         <w:t>Add column to compare the two columns</w:t>
       </w:r>
@@ -9690,6 +9729,208 @@
         </w:rPr>
         <w:t>Replaced NULL with 0 to represent Unknown company ID</w:t>
       </w:r>
+    </w:p>
+    <w:p>
+      <w:pPr>
+        <w:pStyle w:val="ListParagraph"/>
+        <w:numPr>
+          <w:ilvl w:val="0"/>
+          <w:numId w:val="3"/>
+        </w:numPr>
+        <w:rPr>
+          <w:rFonts w:ascii="Calibri" w:hAnsi="Calibri" w:cs="Calibri"/>
+        </w:rPr>
+      </w:pPr>
+      <w:r>
+        <w:rPr>
+          <w:rFonts w:ascii="Calibri" w:hAnsi="Calibri" w:cs="Calibri"/>
+        </w:rPr>
+        <w:t>Is Repeat guest</w:t>
+      </w:r>
+    </w:p>
+    <w:p>
+      <w:pPr>
+        <w:pStyle w:val="ListParagraph"/>
+        <w:numPr>
+          <w:ilvl w:val="1"/>
+          <w:numId w:val="2"/>
+        </w:numPr>
+        <w:rPr>
+          <w:rFonts w:ascii="Calibri" w:hAnsi="Calibri" w:cs="Calibri"/>
+        </w:rPr>
+      </w:pPr>
+      <w:r>
+        <w:rPr>
+          <w:rFonts w:ascii="Calibri" w:hAnsi="Calibri" w:cs="Calibri"/>
+        </w:rPr>
+        <w:t>Replaced the following values:</w:t>
+      </w:r>
+    </w:p>
+    <w:p>
+      <w:pPr>
+        <w:pStyle w:val="ListParagraph"/>
+        <w:numPr>
+          <w:ilvl w:val="2"/>
+          <w:numId w:val="2"/>
+        </w:numPr>
+        <w:rPr>
+          <w:rFonts w:ascii="Calibri" w:hAnsi="Calibri" w:cs="Calibri"/>
+        </w:rPr>
+      </w:pPr>
+      <w:r>
+        <w:rPr>
+          <w:rFonts w:ascii="Calibri" w:hAnsi="Calibri" w:cs="Calibri"/>
+        </w:rPr>
+        <w:t xml:space="preserve">0 </w:t>
+      </w:r>
+      <w:r>
+        <w:rPr>
+          <w:rFonts w:ascii="Calibri" w:hAnsi="Calibri" w:cs="Calibri"/>
+        </w:rPr>
+        <w:sym w:font="Wingdings" w:char="F0E0"/>
+      </w:r>
+      <w:r>
+        <w:rPr>
+          <w:rFonts w:ascii="Calibri" w:hAnsi="Calibri" w:cs="Calibri"/>
+        </w:rPr>
+        <w:t xml:space="preserve"> No</w:t>
+      </w:r>
+    </w:p>
+    <w:p>
+      <w:pPr>
+        <w:pStyle w:val="ListParagraph"/>
+        <w:numPr>
+          <w:ilvl w:val="2"/>
+          <w:numId w:val="2"/>
+        </w:numPr>
+        <w:rPr>
+          <w:rFonts w:ascii="Calibri" w:hAnsi="Calibri" w:cs="Calibri"/>
+        </w:rPr>
+      </w:pPr>
+      <w:r>
+        <w:rPr>
+          <w:rFonts w:ascii="Calibri" w:hAnsi="Calibri" w:cs="Calibri"/>
+        </w:rPr>
+        <w:t xml:space="preserve">1 </w:t>
+      </w:r>
+      <w:r>
+        <w:rPr>
+          <w:rFonts w:ascii="Calibri" w:hAnsi="Calibri" w:cs="Calibri"/>
+        </w:rPr>
+        <w:sym w:font="Wingdings" w:char="F0E0"/>
+      </w:r>
+      <w:r>
+        <w:rPr>
+          <w:rFonts w:ascii="Calibri" w:hAnsi="Calibri" w:cs="Calibri"/>
+        </w:rPr>
+        <w:t xml:space="preserve"> Yes</w:t>
+      </w:r>
+    </w:p>
+    <w:p>
+      <w:pPr>
+        <w:pStyle w:val="ListParagraph"/>
+        <w:ind w:left="2520"/>
+        <w:rPr>
+          <w:rFonts w:ascii="Calibri" w:hAnsi="Calibri" w:cs="Calibri"/>
+        </w:rPr>
+      </w:pPr>
+    </w:p>
+    <w:p>
+      <w:pPr>
+        <w:pStyle w:val="ListParagraph"/>
+        <w:ind w:left="2520"/>
+        <w:rPr>
+          <w:rFonts w:ascii="Calibri" w:hAnsi="Calibri" w:cs="Calibri"/>
+        </w:rPr>
+      </w:pPr>
+    </w:p>
+    <w:p>
+      <w:pPr>
+        <w:pStyle w:val="ListParagraph"/>
+        <w:numPr>
+          <w:ilvl w:val="0"/>
+          <w:numId w:val="3"/>
+        </w:numPr>
+        <w:rPr>
+          <w:rFonts w:ascii="Calibri" w:hAnsi="Calibri" w:cs="Calibri"/>
+        </w:rPr>
+      </w:pPr>
+      <w:r>
+        <w:rPr>
+          <w:rFonts w:ascii="Calibri" w:hAnsi="Calibri" w:cs="Calibri"/>
+        </w:rPr>
+        <w:lastRenderedPageBreak/>
+        <w:t>Added column to compare reserved room type vs. assigned room type</w:t>
+      </w:r>
+    </w:p>
+    <w:p>
+      <w:pPr>
+        <w:pStyle w:val="ListParagraph"/>
+        <w:numPr>
+          <w:ilvl w:val="2"/>
+          <w:numId w:val="2"/>
+        </w:numPr>
+        <w:rPr>
+          <w:rFonts w:ascii="Calibri" w:hAnsi="Calibri" w:cs="Calibri"/>
+        </w:rPr>
+      </w:pPr>
+      <w:r>
+        <w:rPr>
+          <w:rFonts w:ascii="Calibri" w:hAnsi="Calibri" w:cs="Calibri"/>
+        </w:rPr>
+        <w:t xml:space="preserve">If Same </w:t>
+      </w:r>
+      <w:r>
+        <w:rPr>
+          <w:rFonts w:ascii="Calibri" w:hAnsi="Calibri" w:cs="Calibri"/>
+        </w:rPr>
+        <w:sym w:font="Wingdings" w:char="F0E0"/>
+      </w:r>
+      <w:r>
+        <w:rPr>
+          <w:rFonts w:ascii="Calibri" w:hAnsi="Calibri" w:cs="Calibri"/>
+        </w:rPr>
+        <w:t xml:space="preserve"> Same Room</w:t>
+      </w:r>
+    </w:p>
+    <w:p>
+      <w:pPr>
+        <w:pStyle w:val="ListParagraph"/>
+        <w:numPr>
+          <w:ilvl w:val="2"/>
+          <w:numId w:val="2"/>
+        </w:numPr>
+        <w:rPr>
+          <w:rFonts w:ascii="Calibri" w:hAnsi="Calibri" w:cs="Calibri"/>
+        </w:rPr>
+      </w:pPr>
+      <w:r>
+        <w:rPr>
+          <w:rFonts w:ascii="Calibri" w:hAnsi="Calibri" w:cs="Calibri"/>
+        </w:rPr>
+        <w:t xml:space="preserve">Else </w:t>
+      </w:r>
+      <w:r>
+        <w:rPr>
+          <w:rFonts w:ascii="Calibri" w:hAnsi="Calibri" w:cs="Calibri"/>
+        </w:rPr>
+        <w:sym w:font="Wingdings" w:char="F0E0"/>
+      </w:r>
+      <w:r>
+        <w:rPr>
+          <w:rFonts w:ascii="Calibri" w:hAnsi="Calibri" w:cs="Calibri"/>
+        </w:rPr>
+        <w:t xml:space="preserve"> Different Room</w:t>
+      </w:r>
+    </w:p>
+    <w:p>
+      <w:pPr>
+        <w:pStyle w:val="ListParagraph"/>
+        <w:ind w:left="2520"/>
+        <w:rPr>
+          <w:rFonts w:ascii="Calibri" w:hAnsi="Calibri" w:cs="Calibri"/>
+        </w:rPr>
+      </w:pPr>
     </w:p>
     <w:p>
       <w:pPr>
@@ -9715,7 +9956,7 @@
   <w:abstractNum w:abstractNumId="0" w15:restartNumberingAfterBreak="0">
     <w:nsid w:val="15A17BD5"/>
     <w:multiLevelType w:val="hybridMultilevel"/>
-    <w:tmpl w:val="DD0CC5DE"/>
+    <w:tmpl w:val="351A9F10"/>
     <w:lvl w:ilvl="0" w:tplc="0409001B">
       <w:start w:val="1"/>
       <w:numFmt w:val="lowerRoman"/>

</xml_diff>